<commit_message>
Deploy preview for PR 639 🛫
</commit_message>
<xml_diff>
--- a/pr-preview/pr-639/vignettes/articles/version-crosswalk-1.3-to-1.4.docx
+++ b/pr-preview/pr-639/vignettes/articles/version-crosswalk-1.3-to-1.4.docx
@@ -3049,7 +3049,7 @@
         <w:rPr>
           <w:rStyle w:val="CommentTok"/>
         </w:rPr>
-        <w:t xml:space="preserve">#&gt;     age id    antigen_iso   value</w:t>
+        <w:t xml:space="preserve">#&gt;     age id    antigen_iso value</w:t>
       </w:r>
       <w:r>
         <w:br/>
@@ -3058,7 +3058,7 @@
         <w:rPr>
           <w:rStyle w:val="CommentTok"/>
         </w:rPr>
-        <w:t xml:space="preserve">#&gt;   &lt;dbl&gt; &lt;chr&gt; &lt;chr&gt;         &lt;dbl&gt;</w:t>
+        <w:t xml:space="preserve">#&gt;   &lt;dbl&gt; &lt;chr&gt; &lt;chr&gt;       &lt;dbl&gt;</w:t>
       </w:r>
       <w:r>
         <w:br/>
@@ -3067,7 +3067,7 @@
         <w:rPr>
           <w:rStyle w:val="CommentTok"/>
         </w:rPr>
-        <w:t xml:space="preserve">#&gt; 1  9.35 1     HlyE_IgA      0.643</w:t>
+        <w:t xml:space="preserve">#&gt; 1  6.81 1     HlyE_IgA    0.490</w:t>
       </w:r>
       <w:r>
         <w:br/>
@@ -3076,7 +3076,7 @@
         <w:rPr>
           <w:rStyle w:val="CommentTok"/>
         </w:rPr>
-        <w:t xml:space="preserve">#&gt; 2  9.35 1     HlyE_IgG      0.433</w:t>
+        <w:t xml:space="preserve">#&gt; 2  6.81 1     HlyE_IgG    0.651</w:t>
       </w:r>
       <w:r>
         <w:br/>
@@ -3085,7 +3085,7 @@
         <w:rPr>
           <w:rStyle w:val="CommentTok"/>
         </w:rPr>
-        <w:t xml:space="preserve">#&gt; 3 19.8  2     HlyE_IgA      0.988</w:t>
+        <w:t xml:space="preserve">#&gt; 3 13.9  2     HlyE_IgA    0.915</w:t>
       </w:r>
       <w:r>
         <w:br/>
@@ -3094,7 +3094,7 @@
         <w:rPr>
           <w:rStyle w:val="CommentTok"/>
         </w:rPr>
-        <w:t xml:space="preserve">#&gt; 4 19.8  2     HlyE_IgG      1.31 </w:t>
+        <w:t xml:space="preserve">#&gt; 4 13.9  2     HlyE_IgG    0.840</w:t>
       </w:r>
       <w:r>
         <w:br/>
@@ -3103,7 +3103,7 @@
         <w:rPr>
           <w:rStyle w:val="CommentTok"/>
         </w:rPr>
-        <w:t xml:space="preserve">#&gt; 5  9.6  3     HlyE_IgA     41.9  </w:t>
+        <w:t xml:space="preserve">#&gt; 5  2.94 3     HlyE_IgA    0.357</w:t>
       </w:r>
       <w:r>
         <w:br/>
@@ -3112,7 +3112,7 @@
         <w:rPr>
           <w:rStyle w:val="CommentTok"/>
         </w:rPr>
-        <w:t xml:space="preserve">#&gt; 6  9.6  3     HlyE_IgG    569.</w:t>
+        <w:t xml:space="preserve">#&gt; 6  2.94 3     HlyE_IgG    0.362</w:t>
       </w:r>
       <w:r>
         <w:br/>

</xml_diff>